<commit_message>
added presentation for task 2 and cropped img in zvit
</commit_message>
<xml_diff>
--- a/FitForge_Zvit.docx
+++ b/FitForge_Zvit.docx
@@ -231,21 +231,7 @@
       <w:bookmarkStart w:id="0" w:name="docs-internal-guid-216cc1bd-7fff-3c83-b5"/>
       <w:bookmarkEnd w:id="0"/>
       <w:r>
-        <w:rPr>
-          <w:rFonts w:eastAsia="Arial" w:cs="Arial"/>
-          <w:i/>
-          <w:iCs/>
-          <w:caps w:val="false"/>
-          <w:smallCaps w:val="false"/>
-          <w:strike w:val="false"/>
-          <w:dstrike w:val="false"/>
-          <w:color w:val="000000"/>
-          <w:sz w:val="22"/>
-          <w:szCs w:val="22"/>
-          <w:u w:val="none"/>
-          <w:effect w:val="none"/>
-          <w:shd w:fill="auto" w:val="clear"/>
-        </w:rPr>
+        <w:rPr/>
         <w:drawing>
           <wp:inline distT="0" distB="0" distL="0" distR="0">
             <wp:extent cx="5734050" cy="3133725"/>
@@ -502,7 +488,7 @@
         <w:pStyle w:val="ListParagraph"/>
         <w:numPr>
           <w:ilvl w:val="0"/>
-          <w:numId w:val="3"/>
+          <w:numId w:val="4"/>
         </w:numPr>
         <w:spacing w:before="0" w:after="80"/>
         <w:rPr/>
@@ -521,7 +507,7 @@
         <w:pStyle w:val="ListParagraph"/>
         <w:numPr>
           <w:ilvl w:val="0"/>
-          <w:numId w:val="1"/>
+          <w:numId w:val="2"/>
         </w:numPr>
         <w:spacing w:before="0" w:after="80"/>
         <w:rPr/>
@@ -540,7 +526,7 @@
         <w:pStyle w:val="ListParagraph"/>
         <w:numPr>
           <w:ilvl w:val="0"/>
-          <w:numId w:val="1"/>
+          <w:numId w:val="2"/>
         </w:numPr>
         <w:spacing w:before="0" w:after="200"/>
         <w:rPr/>
@@ -570,21 +556,7 @@
       <w:bookmarkStart w:id="1" w:name="docs-internal-guid-b1127f89-7fff-08eb-34"/>
       <w:bookmarkEnd w:id="1"/>
       <w:r>
-        <w:rPr>
-          <w:rFonts w:eastAsia="Arial" w:cs="Arial"/>
-          <w:i/>
-          <w:iCs/>
-          <w:caps w:val="false"/>
-          <w:smallCaps w:val="false"/>
-          <w:strike w:val="false"/>
-          <w:dstrike w:val="false"/>
-          <w:color w:val="000000"/>
-          <w:sz w:val="22"/>
-          <w:szCs w:val="22"/>
-          <w:u w:val="none"/>
-          <w:effect w:val="none"/>
-          <w:shd w:fill="auto" w:val="clear"/>
-        </w:rPr>
+        <w:rPr/>
         <w:drawing>
           <wp:inline distT="0" distB="0" distL="0" distR="0">
             <wp:extent cx="5734050" cy="2847975"/>
@@ -676,21 +648,7 @@
       <w:bookmarkStart w:id="2" w:name="docs-internal-guid-66017706-7fff-3042-3c"/>
       <w:bookmarkEnd w:id="2"/>
       <w:r>
-        <w:rPr>
-          <w:rFonts w:eastAsia="Arial" w:cs="Arial"/>
-          <w:i/>
-          <w:iCs/>
-          <w:caps w:val="false"/>
-          <w:smallCaps w:val="false"/>
-          <w:strike w:val="false"/>
-          <w:dstrike w:val="false"/>
-          <w:color w:val="000000"/>
-          <w:sz w:val="22"/>
-          <w:szCs w:val="22"/>
-          <w:u w:val="none"/>
-          <w:effect w:val="none"/>
-          <w:shd w:fill="auto" w:val="clear"/>
-        </w:rPr>
+        <w:rPr/>
         <w:drawing>
           <wp:inline distT="0" distB="0" distL="0" distR="0">
             <wp:extent cx="5734050" cy="3362325"/>
@@ -782,21 +740,7 @@
       <w:bookmarkStart w:id="3" w:name="docs-internal-guid-3b5e8a1f-7fff-46e4-66"/>
       <w:bookmarkEnd w:id="3"/>
       <w:r>
-        <w:rPr>
-          <w:rFonts w:eastAsia="Arial" w:cs="Arial"/>
-          <w:i/>
-          <w:iCs/>
-          <w:caps w:val="false"/>
-          <w:smallCaps w:val="false"/>
-          <w:strike w:val="false"/>
-          <w:dstrike w:val="false"/>
-          <w:color w:val="000000"/>
-          <w:sz w:val="22"/>
-          <w:szCs w:val="22"/>
-          <w:u w:val="none"/>
-          <w:effect w:val="none"/>
-          <w:shd w:fill="auto" w:val="clear"/>
-        </w:rPr>
+        <w:rPr/>
         <w:drawing>
           <wp:inline distT="0" distB="0" distL="0" distR="0">
             <wp:extent cx="5734050" cy="2895600"/>
@@ -912,21 +856,7 @@
       <w:bookmarkStart w:id="4" w:name="docs-internal-guid-9936257b-7fff-606e-c1"/>
       <w:bookmarkEnd w:id="4"/>
       <w:r>
-        <w:rPr>
-          <w:rFonts w:eastAsia="Arial" w:cs="Arial"/>
-          <w:i/>
-          <w:iCs/>
-          <w:caps w:val="false"/>
-          <w:smallCaps w:val="false"/>
-          <w:strike w:val="false"/>
-          <w:dstrike w:val="false"/>
-          <w:color w:val="000000"/>
-          <w:sz w:val="22"/>
-          <w:szCs w:val="22"/>
-          <w:u w:val="none"/>
-          <w:effect w:val="none"/>
-          <w:shd w:fill="auto" w:val="clear"/>
-        </w:rPr>
+        <w:rPr/>
         <w:drawing>
           <wp:inline distT="0" distB="0" distL="0" distR="0">
             <wp:extent cx="2852420" cy="4074160"/>
@@ -1018,21 +948,7 @@
       <w:bookmarkStart w:id="5" w:name="docs-internal-guid-d50dc030-7fff-7b2b-d6"/>
       <w:bookmarkEnd w:id="5"/>
       <w:r>
-        <w:rPr>
-          <w:rFonts w:eastAsia="Arial" w:cs="Arial"/>
-          <w:i/>
-          <w:iCs/>
-          <w:caps w:val="false"/>
-          <w:smallCaps w:val="false"/>
-          <w:strike w:val="false"/>
-          <w:dstrike w:val="false"/>
-          <w:color w:val="000000"/>
-          <w:sz w:val="22"/>
-          <w:szCs w:val="22"/>
-          <w:u w:val="none"/>
-          <w:effect w:val="none"/>
-          <w:shd w:fill="auto" w:val="clear"/>
-        </w:rPr>
+        <w:rPr/>
         <w:drawing>
           <wp:inline distT="0" distB="0" distL="0" distR="0">
             <wp:extent cx="3076575" cy="4679315"/>
@@ -1121,29 +1037,46 @@
           <w:szCs w:val="22"/>
         </w:rPr>
       </w:pPr>
+      <w:r>
+        <w:rPr>
+          <w:rFonts w:eastAsia="Arial" w:cs="Arial"/>
+          <w:i/>
+          <w:iCs/>
+          <w:color w:val="999999"/>
+          <w:sz w:val="22"/>
+          <w:szCs w:val="22"/>
+        </w:rPr>
+      </w:r>
+    </w:p>
+    <w:p>
+      <w:pPr>
+        <w:pStyle w:val="Normal"/>
+        <w:spacing w:before="0" w:after="200"/>
+        <w:rPr>
+          <w:rFonts w:ascii="Arial" w:hAnsi="Arial" w:eastAsia="Arial" w:cs="Arial"/>
+          <w:i/>
+          <w:iCs/>
+          <w:color w:val="999999"/>
+          <w:sz w:val="22"/>
+          <w:szCs w:val="22"/>
+        </w:rPr>
+      </w:pPr>
       <w:bookmarkStart w:id="6" w:name="docs-internal-guid-5020f3cd-7fff-a888-55"/>
       <w:bookmarkEnd w:id="6"/>
       <w:r>
-        <w:rPr>
-          <w:rFonts w:eastAsia="Arial" w:cs="Arial"/>
-          <w:i/>
-          <w:iCs/>
-          <w:caps w:val="false"/>
-          <w:smallCaps w:val="false"/>
-          <w:strike w:val="false"/>
-          <w:dstrike w:val="false"/>
-          <w:color w:val="000000"/>
-          <w:sz w:val="22"/>
-          <w:szCs w:val="22"/>
-          <w:u w:val="none"/>
-          <w:effect w:val="none"/>
-          <w:shd w:fill="auto" w:val="clear"/>
-        </w:rPr>
         <w:drawing>
-          <wp:inline distT="0" distB="0" distL="0" distR="0">
-            <wp:extent cx="3322955" cy="4827270"/>
+          <wp:anchor distT="0" distB="0" distL="0" distR="0" simplePos="0" relativeHeight="11" behindDoc="0" locked="0" layoutInCell="0" allowOverlap="1">
+            <wp:simplePos x="0" y="0"/>
+            <wp:positionH relativeFrom="column">
+              <wp:posOffset>-120015</wp:posOffset>
+            </wp:positionH>
+            <wp:positionV relativeFrom="paragraph">
+              <wp:posOffset>671830</wp:posOffset>
+            </wp:positionV>
+            <wp:extent cx="3748405" cy="4558030"/>
             <wp:effectExtent l="0" t="0" r="0" b="0"/>
-            <wp:docPr id="7" name="Зображення7"/>
+            <wp:wrapTopAndBottom/>
+            <wp:docPr id="7" name="Зображення10"/>
             <wp:cNvGraphicFramePr>
               <a:graphicFrameLocks xmlns:a="http://schemas.openxmlformats.org/drawingml/2006/main" noChangeAspect="1"/>
             </wp:cNvGraphicFramePr>
@@ -1151,13 +1084,54 @@
               <a:graphicData uri="http://schemas.openxmlformats.org/drawingml/2006/picture">
                 <pic:pic xmlns:pic="http://schemas.openxmlformats.org/drawingml/2006/picture">
                   <pic:nvPicPr>
-                    <pic:cNvPr id="7" name="Зображення7"/>
+                    <pic:cNvPr id="7" name="Зображення10"/>
                     <pic:cNvPicPr>
                       <a:picLocks noChangeAspect="1" noChangeArrowheads="1"/>
                     </pic:cNvPicPr>
                   </pic:nvPicPr>
                   <pic:blipFill>
                     <a:blip r:embed="rId8"/>
+                    <a:stretch>
+                      <a:fillRect/>
+                    </a:stretch>
+                  </pic:blipFill>
+                  <pic:spPr bwMode="auto">
+                    <a:xfrm>
+                      <a:off x="0" y="0"/>
+                      <a:ext cx="3748405" cy="4558030"/>
+                    </a:xfrm>
+                    <a:prstGeom prst="rect">
+                      <a:avLst/>
+                    </a:prstGeom>
+                    <a:noFill/>
+                  </pic:spPr>
+                </pic:pic>
+              </a:graphicData>
+            </a:graphic>
+          </wp:anchor>
+        </w:drawing>
+      </w:r>
+      <w:r>
+        <w:rPr/>
+        <w:drawing>
+          <wp:inline distT="0" distB="0" distL="0" distR="0">
+            <wp:extent cx="3322955" cy="4827270"/>
+            <wp:effectExtent l="0" t="0" r="0" b="0"/>
+            <wp:docPr id="8" name="Зображення7"/>
+            <wp:cNvGraphicFramePr>
+              <a:graphicFrameLocks xmlns:a="http://schemas.openxmlformats.org/drawingml/2006/main" noChangeAspect="1"/>
+            </wp:cNvGraphicFramePr>
+            <a:graphic xmlns:a="http://schemas.openxmlformats.org/drawingml/2006/main">
+              <a:graphicData uri="http://schemas.openxmlformats.org/drawingml/2006/picture">
+                <pic:pic xmlns:pic="http://schemas.openxmlformats.org/drawingml/2006/picture">
+                  <pic:nvPicPr>
+                    <pic:cNvPr id="8" name="Зображення7"/>
+                    <pic:cNvPicPr>
+                      <a:picLocks noChangeAspect="1" noChangeArrowheads="1"/>
+                    </pic:cNvPicPr>
+                  </pic:nvPicPr>
+                  <pic:blipFill>
+                    <a:blip r:embed="rId9"/>
                     <a:stretch>
                       <a:fillRect/>
                     </a:stretch>
@@ -1236,52 +1210,6 @@
           <w:sz w:val="22"/>
           <w:szCs w:val="22"/>
         </w:rPr>
-        <w:drawing>
-          <wp:anchor distT="0" distB="0" distL="0" distR="0" simplePos="0" relativeHeight="11" behindDoc="0" locked="0" layoutInCell="0" allowOverlap="1">
-            <wp:simplePos x="0" y="0"/>
-            <wp:positionH relativeFrom="column">
-              <wp:align>center</wp:align>
-            </wp:positionH>
-            <wp:positionV relativeFrom="paragraph">
-              <wp:posOffset>635</wp:posOffset>
-            </wp:positionV>
-            <wp:extent cx="3800475" cy="4621530"/>
-            <wp:effectExtent l="0" t="0" r="0" b="0"/>
-            <wp:wrapTopAndBottom/>
-            <wp:docPr id="8" name="Зображення10"/>
-            <wp:cNvGraphicFramePr>
-              <a:graphicFrameLocks xmlns:a="http://schemas.openxmlformats.org/drawingml/2006/main" noChangeAspect="1"/>
-            </wp:cNvGraphicFramePr>
-            <a:graphic xmlns:a="http://schemas.openxmlformats.org/drawingml/2006/main">
-              <a:graphicData uri="http://schemas.openxmlformats.org/drawingml/2006/picture">
-                <pic:pic xmlns:pic="http://schemas.openxmlformats.org/drawingml/2006/picture">
-                  <pic:nvPicPr>
-                    <pic:cNvPr id="8" name="Зображення10"/>
-                    <pic:cNvPicPr>
-                      <a:picLocks noChangeAspect="1" noChangeArrowheads="1"/>
-                    </pic:cNvPicPr>
-                  </pic:nvPicPr>
-                  <pic:blipFill>
-                    <a:blip r:embed="rId9"/>
-                    <a:stretch>
-                      <a:fillRect/>
-                    </a:stretch>
-                  </pic:blipFill>
-                  <pic:spPr bwMode="auto">
-                    <a:xfrm>
-                      <a:off x="0" y="0"/>
-                      <a:ext cx="3800475" cy="4621530"/>
-                    </a:xfrm>
-                    <a:prstGeom prst="rect">
-                      <a:avLst/>
-                    </a:prstGeom>
-                    <a:noFill/>
-                  </pic:spPr>
-                </pic:pic>
-              </a:graphicData>
-            </a:graphic>
-          </wp:anchor>
-        </w:drawing>
       </w:r>
     </w:p>
     <w:p>
@@ -1530,7 +1458,14 @@
         </w:rPr>
       </w:pPr>
       <w:r>
-        <w:rPr/>
+        <w:rPr>
+          <w:rFonts w:eastAsia="Arial" w:cs="Arial"/>
+          <w:i/>
+          <w:iCs/>
+          <w:color w:val="999999"/>
+          <w:sz w:val="22"/>
+          <w:szCs w:val="22"/>
+        </w:rPr>
         <w:drawing>
           <wp:anchor distT="0" distB="0" distL="0" distR="0" simplePos="0" relativeHeight="9" behindDoc="0" locked="0" layoutInCell="0" allowOverlap="1">
             <wp:simplePos x="0" y="0"/>
@@ -1720,7 +1655,14 @@
         </w:rPr>
       </w:pPr>
       <w:r>
-        <w:rPr/>
+        <w:rPr>
+          <w:rFonts w:eastAsia="Arial" w:cs="Arial"/>
+          <w:i/>
+          <w:iCs/>
+          <w:color w:val="999999"/>
+          <w:sz w:val="22"/>
+          <w:szCs w:val="22"/>
+        </w:rPr>
         <w:drawing>
           <wp:anchor distT="0" distB="0" distL="0" distR="0" simplePos="0" relativeHeight="10" behindDoc="0" locked="0" layoutInCell="0" allowOverlap="1">
             <wp:simplePos x="0" y="0"/>
@@ -1782,7 +1724,14 @@
         </w:rPr>
       </w:pPr>
       <w:r>
-        <w:rPr/>
+        <w:rPr>
+          <w:rFonts w:eastAsia="Arial" w:cs="Arial"/>
+          <w:i/>
+          <w:iCs/>
+          <w:color w:val="999999"/>
+          <w:sz w:val="24"/>
+          <w:szCs w:val="24"/>
+        </w:rPr>
       </w:r>
     </w:p>
     <w:p>
@@ -1814,7 +1763,7 @@
         <w:pStyle w:val="ListParagraph"/>
         <w:numPr>
           <w:ilvl w:val="0"/>
-          <w:numId w:val="1"/>
+          <w:numId w:val="2"/>
         </w:numPr>
         <w:spacing w:before="0" w:after="80"/>
         <w:rPr/>
@@ -1833,7 +1782,7 @@
         <w:pStyle w:val="ListParagraph"/>
         <w:numPr>
           <w:ilvl w:val="0"/>
-          <w:numId w:val="1"/>
+          <w:numId w:val="2"/>
         </w:numPr>
         <w:spacing w:before="0" w:after="80"/>
         <w:rPr/>
@@ -1852,7 +1801,7 @@
         <w:pStyle w:val="ListParagraph"/>
         <w:numPr>
           <w:ilvl w:val="0"/>
-          <w:numId w:val="1"/>
+          <w:numId w:val="2"/>
         </w:numPr>
         <w:spacing w:before="0" w:after="80"/>
         <w:rPr/>
@@ -1871,7 +1820,7 @@
         <w:pStyle w:val="ListParagraph"/>
         <w:numPr>
           <w:ilvl w:val="0"/>
-          <w:numId w:val="1"/>
+          <w:numId w:val="2"/>
         </w:numPr>
         <w:spacing w:before="0" w:after="80"/>
         <w:rPr/>
@@ -1890,7 +1839,7 @@
         <w:pStyle w:val="ListParagraph"/>
         <w:numPr>
           <w:ilvl w:val="0"/>
-          <w:numId w:val="1"/>
+          <w:numId w:val="2"/>
         </w:numPr>
         <w:spacing w:before="0" w:after="200"/>
         <w:rPr/>
@@ -1946,6 +1895,7 @@
         </w:tabs>
         <w:ind w:start="1080" w:hanging="360"/>
       </w:pPr>
+      <w:rPr/>
     </w:lvl>
     <w:lvl w:ilvl="2">
       <w:start w:val="1"/>
@@ -1958,6 +1908,7 @@
         </w:tabs>
         <w:ind w:start="1440" w:hanging="360"/>
       </w:pPr>
+      <w:rPr/>
     </w:lvl>
     <w:lvl w:ilvl="3">
       <w:start w:val="1"/>
@@ -1970,6 +1921,7 @@
         </w:tabs>
         <w:ind w:start="1800" w:hanging="360"/>
       </w:pPr>
+      <w:rPr/>
     </w:lvl>
     <w:lvl w:ilvl="4">
       <w:start w:val="1"/>
@@ -1982,6 +1934,7 @@
         </w:tabs>
         <w:ind w:start="2160" w:hanging="360"/>
       </w:pPr>
+      <w:rPr/>
     </w:lvl>
     <w:lvl w:ilvl="5">
       <w:start w:val="1"/>
@@ -1994,6 +1947,7 @@
         </w:tabs>
         <w:ind w:start="2520" w:hanging="360"/>
       </w:pPr>
+      <w:rPr/>
     </w:lvl>
     <w:lvl w:ilvl="6">
       <w:start w:val="1"/>
@@ -2006,6 +1960,7 @@
         </w:tabs>
         <w:ind w:start="2880" w:hanging="360"/>
       </w:pPr>
+      <w:rPr/>
     </w:lvl>
     <w:lvl w:ilvl="7">
       <w:start w:val="1"/>
@@ -2018,6 +1973,7 @@
         </w:tabs>
         <w:ind w:start="3240" w:hanging="360"/>
       </w:pPr>
+      <w:rPr/>
     </w:lvl>
     <w:lvl w:ilvl="8">
       <w:start w:val="1"/>
@@ -2030,9 +1986,131 @@
         </w:tabs>
         <w:ind w:start="3600" w:hanging="360"/>
       </w:pPr>
+      <w:rPr/>
     </w:lvl>
   </w:abstractNum>
   <w:abstractNum w:abstractNumId="2">
+    <w:lvl w:ilvl="0">
+      <w:start w:val="1"/>
+      <w:numFmt w:val="bullet"/>
+      <w:lvlText w:val=""/>
+      <w:lvlJc w:val="start"/>
+      <w:pPr>
+        <w:tabs>
+          <w:tab w:val="num" w:pos="0"/>
+        </w:tabs>
+        <w:ind w:start="720" w:hanging="360"/>
+      </w:pPr>
+      <w:rPr>
+        <w:rFonts w:ascii="Symbol" w:hAnsi="Symbol" w:cs="Symbol" w:hint="default"/>
+      </w:rPr>
+    </w:lvl>
+    <w:lvl w:ilvl="1">
+      <w:start w:val="1"/>
+      <w:numFmt w:val="decimal"/>
+      <w:lvlText w:val="%2."/>
+      <w:lvlJc w:val="start"/>
+      <w:pPr>
+        <w:tabs>
+          <w:tab w:val="num" w:pos="1080"/>
+        </w:tabs>
+        <w:ind w:start="1080" w:hanging="360"/>
+      </w:pPr>
+      <w:rPr/>
+    </w:lvl>
+    <w:lvl w:ilvl="2">
+      <w:start w:val="1"/>
+      <w:numFmt w:val="decimal"/>
+      <w:lvlText w:val="%3."/>
+      <w:lvlJc w:val="start"/>
+      <w:pPr>
+        <w:tabs>
+          <w:tab w:val="num" w:pos="1440"/>
+        </w:tabs>
+        <w:ind w:start="1440" w:hanging="360"/>
+      </w:pPr>
+      <w:rPr/>
+    </w:lvl>
+    <w:lvl w:ilvl="3">
+      <w:start w:val="1"/>
+      <w:numFmt w:val="decimal"/>
+      <w:lvlText w:val="%4."/>
+      <w:lvlJc w:val="start"/>
+      <w:pPr>
+        <w:tabs>
+          <w:tab w:val="num" w:pos="1800"/>
+        </w:tabs>
+        <w:ind w:start="1800" w:hanging="360"/>
+      </w:pPr>
+      <w:rPr/>
+    </w:lvl>
+    <w:lvl w:ilvl="4">
+      <w:start w:val="1"/>
+      <w:numFmt w:val="decimal"/>
+      <w:lvlText w:val="%5."/>
+      <w:lvlJc w:val="start"/>
+      <w:pPr>
+        <w:tabs>
+          <w:tab w:val="num" w:pos="2160"/>
+        </w:tabs>
+        <w:ind w:start="2160" w:hanging="360"/>
+      </w:pPr>
+      <w:rPr/>
+    </w:lvl>
+    <w:lvl w:ilvl="5">
+      <w:start w:val="1"/>
+      <w:numFmt w:val="decimal"/>
+      <w:lvlText w:val="%6."/>
+      <w:lvlJc w:val="start"/>
+      <w:pPr>
+        <w:tabs>
+          <w:tab w:val="num" w:pos="2520"/>
+        </w:tabs>
+        <w:ind w:start="2520" w:hanging="360"/>
+      </w:pPr>
+      <w:rPr/>
+    </w:lvl>
+    <w:lvl w:ilvl="6">
+      <w:start w:val="1"/>
+      <w:numFmt w:val="decimal"/>
+      <w:lvlText w:val="%7."/>
+      <w:lvlJc w:val="start"/>
+      <w:pPr>
+        <w:tabs>
+          <w:tab w:val="num" w:pos="2880"/>
+        </w:tabs>
+        <w:ind w:start="2880" w:hanging="360"/>
+      </w:pPr>
+      <w:rPr/>
+    </w:lvl>
+    <w:lvl w:ilvl="7">
+      <w:start w:val="1"/>
+      <w:numFmt w:val="decimal"/>
+      <w:lvlText w:val="%8."/>
+      <w:lvlJc w:val="start"/>
+      <w:pPr>
+        <w:tabs>
+          <w:tab w:val="num" w:pos="3240"/>
+        </w:tabs>
+        <w:ind w:start="3240" w:hanging="360"/>
+      </w:pPr>
+      <w:rPr/>
+    </w:lvl>
+    <w:lvl w:ilvl="8">
+      <w:start w:val="1"/>
+      <w:numFmt w:val="decimal"/>
+      <w:lvlText w:val="%9."/>
+      <w:lvlJc w:val="start"/>
+      <w:pPr>
+        <w:tabs>
+          <w:tab w:val="num" w:pos="3600"/>
+        </w:tabs>
+        <w:ind w:start="3600" w:hanging="360"/>
+      </w:pPr>
+      <w:rPr/>
+    </w:lvl>
+  </w:abstractNum>
+  <w:abstractNum w:abstractNumId="3">
     <w:lvl w:ilvl="0">
       <w:start w:val="1"/>
       <w:numFmt w:val="none"/>
@@ -2158,7 +2236,10 @@
     <w:abstractNumId w:val="2"/>
   </w:num>
   <w:num w:numId="3">
-    <w:abstractNumId w:val="1"/>
+    <w:abstractNumId w:val="3"/>
+  </w:num>
+  <w:num w:numId="4">
+    <w:abstractNumId w:val="2"/>
     <w:lvlOverride w:ilvl="0">
       <w:startOverride w:val="1"/>
     </w:lvlOverride>
@@ -2188,6 +2269,7 @@
     <w:qFormat/>
     <w:pPr>
       <w:widowControl/>
+      <w:suppressAutoHyphens w:val="true"/>
       <w:bidi w:val="0"/>
       <w:spacing w:before="0" w:after="0"/>
       <w:jc w:val="start"/>
@@ -2203,7 +2285,7 @@
   </w:style>
   <w:style w:type="paragraph" w:styleId="Heading1">
     <w:name w:val="heading 1"/>
-    <w:basedOn w:val="Style10"/>
+    <w:basedOn w:val="user2"/>
     <w:qFormat/>
     <w:pPr>
       <w:spacing w:before="300" w:after="200"/>
@@ -2220,7 +2302,7 @@
   </w:style>
   <w:style w:type="paragraph" w:styleId="Heading2">
     <w:name w:val="heading 2"/>
-    <w:basedOn w:val="Style10"/>
+    <w:basedOn w:val="user2"/>
     <w:qFormat/>
     <w:pPr>
       <w:spacing w:before="240" w:after="120"/>
@@ -2237,7 +2319,7 @@
   </w:style>
   <w:style w:type="paragraph" w:styleId="Heading3">
     <w:name w:val="heading 3"/>
-    <w:basedOn w:val="Style10"/>
+    <w:basedOn w:val="user2"/>
     <w:qFormat/>
     <w:pPr/>
     <w:rPr>
@@ -2248,7 +2330,7 @@
   </w:style>
   <w:style w:type="paragraph" w:styleId="Heading4">
     <w:name w:val="heading 4"/>
-    <w:basedOn w:val="Style10"/>
+    <w:basedOn w:val="user2"/>
     <w:qFormat/>
     <w:pPr/>
     <w:rPr>
@@ -2259,7 +2341,7 @@
   </w:style>
   <w:style w:type="paragraph" w:styleId="Heading5">
     <w:name w:val="heading 5"/>
-    <w:basedOn w:val="Style10"/>
+    <w:basedOn w:val="user2"/>
     <w:qFormat/>
     <w:pPr/>
     <w:rPr>
@@ -2268,7 +2350,7 @@
   </w:style>
   <w:style w:type="paragraph" w:styleId="Heading6">
     <w:name w:val="heading 6"/>
-    <w:basedOn w:val="Style10"/>
+    <w:basedOn w:val="user2"/>
     <w:qFormat/>
     <w:pPr/>
     <w:rPr>
@@ -2284,11 +2366,18 @@
       <w:u w:val="single"/>
     </w:rPr>
   </w:style>
-  <w:style w:type="character" w:styleId="Style8">
-    <w:name w:val="Символи виноски"/>
+  <w:style w:type="character" w:styleId="user">
+    <w:name w:val="Символи виноски (user)"/>
     <w:uiPriority w:val="99"/>
     <w:semiHidden/>
     <w:unhideWhenUsed/>
+    <w:qFormat/>
+    <w:rPr>
+      <w:vertAlign w:val="superscript"/>
+    </w:rPr>
+  </w:style>
+  <w:style w:type="character" w:styleId="Style8">
+    <w:name w:val="Символи виноски"/>
     <w:qFormat/>
     <w:rPr>
       <w:vertAlign w:val="superscript"/>
@@ -2311,11 +2400,18 @@
       <w:szCs w:val="20"/>
     </w:rPr>
   </w:style>
-  <w:style w:type="character" w:styleId="Style9">
-    <w:name w:val="Символи кінцевої виноски"/>
+  <w:style w:type="character" w:styleId="user1">
+    <w:name w:val="Символи кінцевої виноски (user)"/>
     <w:uiPriority w:val="99"/>
     <w:semiHidden/>
     <w:unhideWhenUsed/>
+    <w:qFormat/>
+    <w:rPr>
+      <w:vertAlign w:val="superscript"/>
+    </w:rPr>
+  </w:style>
+  <w:style w:type="character" w:styleId="Style9">
+    <w:name w:val="Символи кінцевої виноски"/>
     <w:qFormat/>
     <w:rPr>
       <w:vertAlign w:val="superscript"/>
@@ -2396,9 +2492,35 @@
       <w:rFonts w:cs="Arial"/>
     </w:rPr>
   </w:style>
+  <w:style w:type="paragraph" w:styleId="user2">
+    <w:name w:val="Заголовок (user)"/>
+    <w:basedOn w:val="Normal"/>
+    <w:next w:val="BodyText"/>
+    <w:qFormat/>
+    <w:pPr>
+      <w:keepNext w:val="true"/>
+      <w:spacing w:before="240" w:after="120"/>
+    </w:pPr>
+    <w:rPr>
+      <w:rFonts w:ascii="Liberation Sans" w:hAnsi="Liberation Sans" w:eastAsia="Microsoft YaHei" w:cs="Arial"/>
+      <w:sz w:val="28"/>
+      <w:szCs w:val="28"/>
+    </w:rPr>
+  </w:style>
+  <w:style w:type="paragraph" w:styleId="user3">
+    <w:name w:val="Покажчик (user)"/>
+    <w:basedOn w:val="Normal"/>
+    <w:qFormat/>
+    <w:pPr>
+      <w:suppressLineNumbers/>
+    </w:pPr>
+    <w:rPr>
+      <w:rFonts w:cs="Arial"/>
+    </w:rPr>
+  </w:style>
   <w:style w:type="paragraph" w:styleId="Title">
     <w:name w:val="Title"/>
-    <w:basedOn w:val="Style10"/>
+    <w:basedOn w:val="user2"/>
     <w:qFormat/>
     <w:pPr/>
     <w:rPr>
@@ -2411,6 +2533,7 @@
     <w:qFormat/>
     <w:pPr>
       <w:widowControl/>
+      <w:suppressAutoHyphens w:val="true"/>
       <w:bidi w:val="0"/>
       <w:spacing w:before="0" w:after="0"/>
       <w:jc w:val="start"/>
@@ -2431,6 +2554,7 @@
     <w:qFormat/>
     <w:pPr>
       <w:widowControl/>
+      <w:suppressAutoHyphens w:val="true"/>
       <w:bidi w:val="0"/>
       <w:spacing w:before="0" w:after="0"/>
       <w:jc w:val="start"/>

</xml_diff>